<commit_message>
Generalize analysis report template with placeholder system
</commit_message>
<xml_diff>
--- a/examples/docx/en/sample-report.docx
+++ b/examples/docx/en/sample-report.docx
@@ -2286,52 +2286,7 @@
         </w:rPr>
       </w:pPr>
       <w:r>
-        <w:t xml:space="preserve">At the Brazil site of the HCS 851, the </w:t>
-      </w:r>
-      <w:r>
-        <w:t>default</w:t>
-      </w:r>
-      <w:r>
-        <w:rPr>
-          <w:rFonts w:hint="default"/>
-        </w:rPr>
-        <w:t xml:space="preserve"> </w:t>
-      </w:r>
-      <w:r>
-        <w:t xml:space="preserve">enterprise project cannot be </w:t>
-      </w:r>
-      <w:r>
-        <w:t>showed</w:t>
-      </w:r>
-      <w:r>
-        <w:t xml:space="preserve"> on the ECS creation page</w:t>
-      </w:r>
-      <w:r>
-        <w:t>，</w:t>
-      </w:r>
-      <w:r>
-        <w:t>c</w:t>
-      </w:r>
-      <w:r>
-        <w:rPr>
-          <w:rFonts w:hint="default"/>
-        </w:rPr>
-        <w:t xml:space="preserve">ausing ECS </w:t>
-      </w:r>
-      <w:r>
-        <w:t>cannot</w:t>
-      </w:r>
-      <w:r>
-        <w:rPr>
-          <w:rFonts w:hint="default"/>
-        </w:rPr>
-        <w:t xml:space="preserve"> be created</w:t>
-      </w:r>
-      <w:r>
-        <w:rPr>
-          <w:rFonts w:hint="default"/>
-        </w:rPr>
-        <w:t>.</w:t>
+        <w:t>At the Brazil site of HCS 8.5.1, the default enterprise project is not displayed on the ECS creation page. This prevents users from selecting the correct enterprise project when provisioning new ECS instances.</w:t>
       </w:r>
     </w:p>
     <w:p>
@@ -2442,31 +2397,37 @@
         </w:rPr>
       </w:pPr>
       <w:r>
-        <w:t xml:space="preserve">Analyze the permissions of the user who cannot view the </w:t>
+        <w:t>1. Analyzed the permissions of the user who cannot view the default enterprise project</w:t>
       </w:r>
-      <w:r>
-        <w:t>default</w:t>
-      </w:r>
-      <w:r>
+    </w:p>
+    <w:p>
+      <w:pPr>
+        <w:pStyle w:val="ItemStep"/>
+        <w:numPr>
+          <w:ilvl w:val="0"/>
+          <w:numId w:val="28"/>
+        </w:numPr>
         <w:rPr>
           <w:rFonts w:hint="default"/>
         </w:rPr>
-        <w:t xml:space="preserve"> </w:t>
+      </w:pPr>
+      <w:r>
+        <w:t xml:space="preserve">2. Verified the auth_action field behavior in version 8.5.1</w:t>
       </w:r>
-      <w:r>
-        <w:t xml:space="preserve">enterprise project. Only the Server Administrator permission is granted to the user. Other users who can view the </w:t>
-      </w:r>
-      <w:r>
-        <w:t>default</w:t>
-      </w:r>
-      <w:r>
+    </w:p>
+    <w:p>
+      <w:pPr>
+        <w:pStyle w:val="ItemStep"/>
+        <w:numPr>
+          <w:ilvl w:val="0"/>
+          <w:numId w:val="28"/>
+        </w:numPr>
         <w:rPr>
           <w:rFonts w:hint="default"/>
         </w:rPr>
-        <w:t xml:space="preserve"> </w:t>
-      </w:r>
+      </w:pPr>
       <w:r>
-        <w:t>enterprise project are granted the Tenant Administrator permission.</w:t>
+        <w:t xml:space="preserve">3. Confirmed the Server Administrator role lacks fine-grained action permissions</w:t>
       </w:r>
     </w:p>
     <w:p>
@@ -2541,45 +2502,6 @@
           <w:rFonts w:hint="default"/>
         </w:rPr>
       </w:pPr>
-      <w:r>
-        <w:t xml:space="preserve">In the 851 version, the auth_action field is added when you query an enterprise project. </w:t>
-      </w:r>
-      <w:r>
-        <w:rPr>
-          <w:rFonts w:hint="default"/>
-        </w:rPr>
-        <w:t>If this field is not passed in fine-grained authorization scenarios</w:t>
-      </w:r>
-      <w:r>
-        <w:t xml:space="preserve">, </w:t>
-      </w:r>
-      <w:r>
-        <w:t>t</w:t>
-      </w:r>
-      <w:r>
-        <w:rPr>
-          <w:rFonts w:hint="default"/>
-        </w:rPr>
-        <w:t xml:space="preserve">he page will display enterprise projects without the permission to create </w:t>
-      </w:r>
-      <w:r>
-        <w:rPr>
-          <w:rFonts w:hint="default"/>
-        </w:rPr>
-        <w:t>ECS</w:t>
-      </w:r>
-      <w:r>
-        <w:t xml:space="preserve">. After the user selects the enterprise project, the </w:t>
-      </w:r>
-      <w:r>
-        <w:rPr>
-          <w:rFonts w:hint="default"/>
-        </w:rPr>
-        <w:t>ECS</w:t>
-      </w:r>
-      <w:r>
-        <w:t xml:space="preserve"> cannot be provisioned. Therefore, this field is added. Only the enterprise projects with the permission are displayed on the page for creating an ECS.</w:t>
-      </w:r>
     </w:p>
     <w:p>
       <w:pPr>
@@ -2592,39 +2514,6 @@
           <w:rFonts w:hint="default"/>
         </w:rPr>
       </w:pPr>
-      <w:r>
-        <w:t>Server Administrator already exists in earlier versions and does not have the fine-grained action permission. Therefore, when the M</w:t>
-      </w:r>
-      <w:r>
-        <w:t>anageOne</w:t>
-      </w:r>
-      <w:r>
-        <w:t xml:space="preserve"> interface is invoked to query enterprise projects, Server Administrator does not have the permission to create ECSs and does not return the enterprise project list. However, for the ECS service, this permission is the ECS administrator</w:t>
-      </w:r>
-      <w:r>
-        <w:t>，</w:t>
-      </w:r>
-      <w:r>
-        <w:t>and</w:t>
-      </w:r>
-      <w:r>
-        <w:rPr>
-          <w:rFonts w:hint="default"/>
-        </w:rPr>
-        <w:t xml:space="preserve"> </w:t>
-      </w:r>
-      <w:r>
-        <w:t>it</w:t>
-      </w:r>
-      <w:r>
-        <w:t xml:space="preserve"> ha</w:t>
-      </w:r>
-      <w:r>
-        <w:t>s</w:t>
-      </w:r>
-      <w:r>
-        <w:t xml:space="preserve"> the permission to create ECS.</w:t>
-      </w:r>
     </w:p>
     <w:p>
       <w:pPr>
@@ -2668,22 +2557,7 @@
         </w:rPr>
       </w:pPr>
       <w:r>
-        <w:t>Optimized the fine-grained scenario in 851. When a</w:t>
-      </w:r>
-      <w:r>
-        <w:t>n</w:t>
-      </w:r>
-      <w:r>
-        <w:t xml:space="preserve"> </w:t>
-      </w:r>
-      <w:r>
-        <w:rPr>
-          <w:rFonts w:hint="default"/>
-        </w:rPr>
-        <w:t>ECS</w:t>
-      </w:r>
-      <w:r>
-        <w:t xml:space="preserve"> is provisioned, only the list of enterprise projects with the permission is displayed. Server Administrator is a role in non-fine-grained scenarios and does not contain the new fine-grained permission configuration items. As a result, users with the Server Administrator permission cannot query the list of enterprise projects with the permission in this scenario.</w:t>
+        <w:t>In version 8.5.1, the fine-grained permission scenario was optimized. When an ECS is provisioned, only enterprise projects with the appropriate permissions are listed. The Server Administrator role does not include ECS FullAccess.</w:t>
       </w:r>
     </w:p>
     <w:p>
@@ -2714,12 +2588,11 @@
       <w:bookmarkStart w:id="11" w:name="_Toc256000003"/>
       <w:bookmarkStart w:id="12" w:name="_ZH-CN_TOPIC_0000002429158585-chtext"/>
       <w:bookmarkEnd w:id="10"/>
+      <w:bookmarkEnd w:id="11"/>
+      <w:bookmarkEnd w:id="12"/>
       <w:r>
-        <w:lastRenderedPageBreak/>
         <w:t>Trigger Condition</w:t>
       </w:r>
-      <w:bookmarkEnd w:id="11"/>
-      <w:bookmarkEnd w:id="12"/>
     </w:p>
     <w:tbl>
       <w:tblPr>
@@ -2771,12 +2644,6 @@
             </w:tcBorders>
           </w:tcPr>
           <w:p>
-            <w:pPr>
-              <w:pStyle w:val="TableText"/>
-              <w:rPr>
-                <w:rFonts w:hint="default"/>
-              </w:rPr>
-            </w:pPr>
             <w:r>
               <w:t>HCS 8.5.1</w:t>
             </w:r>
@@ -2814,12 +2681,6 @@
             </w:tcBorders>
           </w:tcPr>
           <w:p>
-            <w:pPr>
-              <w:pStyle w:val="TableText"/>
-              <w:rPr>
-                <w:rFonts w:hint="default"/>
-              </w:rPr>
-            </w:pPr>
             <w:r>
               <w:t>Standard Scenario</w:t>
             </w:r>
@@ -2900,14 +2761,8 @@
             </w:tcBorders>
           </w:tcPr>
           <w:p>
-            <w:pPr>
-              <w:pStyle w:val="TableText"/>
-              <w:rPr>
-                <w:rFonts w:hint="default"/>
-              </w:rPr>
-            </w:pPr>
             <w:r>
-              <w:t>Assign ECS-related permissions to a user as the Server Administrator role.</w:t>
+              <w:t>Occurs when a user with only the Server Administrator role attempts to create an ECS instance in HCS 8.5.1.</w:t>
             </w:r>
           </w:p>
         </w:tc>
@@ -2929,6 +2784,9 @@
           <w:docGrid w:linePitch="312"/>
         </w:sectPr>
       </w:pPr>
+      <w:r>
+        <w:t>Occurs when a user with only the Server Administrator role attempts to create an ECS instance in HCS 8.5.1.</w:t>
+      </w:r>
     </w:p>
     <w:p>
       <w:pPr>
@@ -3093,7 +2951,7 @@
         </w:rPr>
       </w:pPr>
       <w:r>
-        <w:t>To grant ECS FullAccess to a user, you need to modify the user group permission.</w:t>
+        <w:t>To grant ECS FullAccess to a user, you need to modify the user group permission. This permission is the ECS administrator permission and is included in the Server Administrator permission.</w:t>
       </w:r>
     </w:p>
     <w:p>
@@ -3102,24 +2960,6 @@
           <w:rFonts w:hint="default"/>
         </w:rPr>
       </w:pPr>
-      <w:r>
-        <w:t>This permission is the ECS administrator permission and is included in the Server Administrator permission. When this permission and Server Administrator permission are granted at the same time, the permission does not increase. However, this permission</w:t>
-      </w:r>
-      <w:r>
-        <w:rPr>
-          <w:rFonts w:hint="default"/>
-        </w:rPr>
-        <w:t xml:space="preserve"> </w:t>
-      </w:r>
-      <w:r>
-        <w:t>can query the list of enterprise projects with th</w:t>
-      </w:r>
-      <w:r>
-        <w:t>e</w:t>
-      </w:r>
-      <w:r>
-        <w:t xml:space="preserve"> permission.</w:t>
-      </w:r>
     </w:p>
     <w:p>
       <w:pPr>
@@ -3148,7 +2988,7 @@
         <w:rPr>
           <w:rFonts w:hint="default"/>
         </w:rPr>
-        <w:t>N/A</w:t>
+        <w:t>N/A — no data modification required.</w:t>
       </w:r>
     </w:p>
     <w:p>
@@ -3180,73 +3020,37 @@
         </w:rPr>
       </w:pPr>
       <w:r>
-        <w:t>Log in to the tenant plane and find the user group associated with the user</w:t>
+        <w:t>1. Log in to the tenant plane and find the user group associated with the affected user</w:t>
       </w:r>
-      <w:r>
+    </w:p>
+    <w:p>
+      <w:pPr>
+        <w:pStyle w:val="Step"/>
+        <w:numPr>
+          <w:ilvl w:val="6"/>
+          <w:numId w:val="30"/>
+        </w:numPr>
         <w:rPr>
           <w:rFonts w:hint="default"/>
         </w:rPr>
-        <w:t xml:space="preserve"> </w:t>
+      </w:pPr>
+      <w:r>
+        <w:t xml:space="preserve">2. Add the ECS FullAccess permission to the user group</w:t>
       </w:r>
-      <w:r>
-        <w:t>which</w:t>
-      </w:r>
-      <w:r>
+    </w:p>
+    <w:p>
+      <w:pPr>
+        <w:pStyle w:val="Step"/>
+        <w:numPr>
+          <w:ilvl w:val="6"/>
+          <w:numId w:val="30"/>
+        </w:numPr>
         <w:rPr>
           <w:rFonts w:hint="default"/>
         </w:rPr>
-        <w:t xml:space="preserve"> </w:t>
-      </w:r>
+      </w:pPr>
       <w:r>
-        <w:t>cannot</w:t>
-      </w:r>
-      <w:r>
-        <w:rPr>
-          <w:rFonts w:hint="default"/>
-        </w:rPr>
-        <w:t xml:space="preserve"> </w:t>
-      </w:r>
-      <w:r>
-        <w:t>view</w:t>
-      </w:r>
-      <w:r>
-        <w:rPr>
-          <w:rFonts w:hint="default"/>
-        </w:rPr>
-        <w:t xml:space="preserve"> </w:t>
-      </w:r>
-      <w:r>
-        <w:t>the</w:t>
-      </w:r>
-      <w:r>
-        <w:rPr>
-          <w:rFonts w:hint="default"/>
-        </w:rPr>
-        <w:t xml:space="preserve"> </w:t>
-      </w:r>
-      <w:r>
-        <w:t>default</w:t>
-      </w:r>
-      <w:r>
-        <w:rPr>
-          <w:rFonts w:hint="default"/>
-        </w:rPr>
-        <w:t xml:space="preserve"> </w:t>
-      </w:r>
-      <w:r>
-        <w:t>enterprise</w:t>
-      </w:r>
-      <w:r>
-        <w:rPr>
-          <w:rFonts w:hint="default"/>
-        </w:rPr>
-        <w:t xml:space="preserve"> </w:t>
-      </w:r>
-      <w:r>
-        <w:t>project</w:t>
-      </w:r>
-      <w:r>
-        <w:t>.</w:t>
+        <w:t xml:space="preserve">3. Verify the permission is applied correctly</w:t>
       </w:r>
     </w:p>
     <w:p>
@@ -3317,9 +3121,6 @@
           <w:rFonts w:hint="default"/>
         </w:rPr>
       </w:pPr>
-      <w:r>
-        <w:t>Adding the ECS FullAccess permission to a user group</w:t>
-      </w:r>
     </w:p>
     <w:p>
       <w:pPr>
@@ -3388,9 +3189,6 @@
           <w:rFonts w:hint="default"/>
         </w:rPr>
       </w:pPr>
-      <w:r>
-        <w:t>----End</w:t>
-      </w:r>
     </w:p>
     <w:p>
       <w:pPr>
@@ -3421,7 +3219,7 @@
         </w:rPr>
       </w:pPr>
       <w:r>
-        <w:t>Log in to the tenant page again, go to the ECS page, create an ECS, and view the enterprise project list.</w:t>
+        <w:t>Log in to the tenant page again, go to the ECS page, create an ECS, and verify the enterprise project list is now displayed.</w:t>
       </w:r>
     </w:p>
     <w:p>
@@ -3462,7 +3260,7 @@
         <w:rPr>
           <w:rFonts w:hint="default"/>
         </w:rPr>
-        <w:t>N/A</w:t>
+        <w:t>Remove the ECS FullAccess permission from the user group.</w:t>
       </w:r>
     </w:p>
     <w:p>
@@ -3493,399 +3291,9 @@
         <w:rPr>
           <w:rFonts w:hint="default"/>
         </w:rPr>
-        <w:t>N/A</w:t>
+        <w:t>No cleanup required.</w:t>
       </w:r>
     </w:p>
-    <w:p>
-      <w:pPr>
-        <w:pStyle w:val="Heading1"/>
-      </w:pPr>
-      <w:r>
-        <w:rPr>
-          <w:color w:val="C7000B"/>
-        </w:rPr>
-        <w:t>Problem Description and Impact</w:t>
-      </w:r>
-    </w:p>
-    <w:p>
-      <w:pPr/>
-      <w:r>
-        <w:t>At the Brazil site of HCS 8.5.1, the default enterprise project is not displayed on the ECS creation page. This prevents users from selecting the correct enterprise project when provisioning new ECS instances.</w:t>
-      </w:r>
-    </w:p>
-    <w:p>
-      <w:pPr>
-        <w:pStyle w:val="Heading1"/>
-      </w:pPr>
-      <w:r>
-        <w:rPr>
-          <w:color w:val="C7000B"/>
-        </w:rPr>
-        <w:t>Affected Versions</w:t>
-      </w:r>
-    </w:p>
-    <w:tbl>
-      <w:tblPr>
-        <w:tblW w:type="auto" w:w="0"/>
-        <w:jc w:val="center"/>
-        <w:tblLook w:firstColumn="1" w:firstRow="1" w:lastColumn="0" w:lastRow="0" w:noHBand="0" w:noVBand="1" w:val="04A0"/>
-        <w:tblBorders>
-          <w:top w:val="single" w:sz="4" w:space="0" w:color="C7000B"/>
-          <w:left w:val="single" w:sz="4" w:space="0" w:color="C7000B"/>
-          <w:bottom w:val="single" w:sz="4" w:space="0" w:color="C7000B"/>
-          <w:right w:val="single" w:sz="4" w:space="0" w:color="C7000B"/>
-          <w:insideH w:val="single" w:sz="4" w:space="0" w:color="C7000B"/>
-          <w:insideV w:val="single" w:sz="4" w:space="0" w:color="C7000B"/>
-        </w:tblBorders>
-      </w:tblPr>
-      <w:tblGrid>
-        <w:gridCol w:w="3213"/>
-        <w:gridCol w:w="3213"/>
-        <w:gridCol w:w="3213"/>
-      </w:tblGrid>
-      <w:tr>
-        <w:tc>
-          <w:tcPr>
-            <w:tcW w:type="dxa" w:w="3213"/>
-            <w:shd w:fill="C7000B" w:val="clear"/>
-          </w:tcPr>
-          <w:p>
-            <w:pPr>
-              <w:jc w:val="center"/>
-            </w:pPr>
-            <w:r/>
-            <w:r>
-              <w:rPr>
-                <w:b/>
-                <w:color w:val="FFFFFF"/>
-                <w:sz w:val="20"/>
-              </w:rPr>
-              <w:t>Version</w:t>
-            </w:r>
-          </w:p>
-        </w:tc>
-        <w:tc>
-          <w:tcPr>
-            <w:tcW w:type="dxa" w:w="3213"/>
-            <w:shd w:fill="C7000B" w:val="clear"/>
-          </w:tcPr>
-          <w:p>
-            <w:pPr>
-              <w:jc w:val="center"/>
-            </w:pPr>
-            <w:r/>
-            <w:r>
-              <w:rPr>
-                <w:b/>
-                <w:color w:val="FFFFFF"/>
-                <w:sz w:val="20"/>
-              </w:rPr>
-              <w:t>Installation Scenario</w:t>
-            </w:r>
-          </w:p>
-        </w:tc>
-        <w:tc>
-          <w:tcPr>
-            <w:tcW w:type="dxa" w:w="3213"/>
-            <w:shd w:fill="C7000B" w:val="clear"/>
-          </w:tcPr>
-          <w:p>
-            <w:pPr>
-              <w:jc w:val="center"/>
-            </w:pPr>
-            <w:r/>
-            <w:r>
-              <w:rPr>
-                <w:b/>
-                <w:color w:val="FFFFFF"/>
-                <w:sz w:val="20"/>
-              </w:rPr>
-              <w:t>Affected</w:t>
-            </w:r>
-          </w:p>
-        </w:tc>
-      </w:tr>
-      <w:tr>
-        <w:tc>
-          <w:tcPr>
-            <w:tcW w:type="dxa" w:w="3213"/>
-            <w:shd w:fill="F6F8FA" w:val="clear"/>
-          </w:tcPr>
-          <w:p>
-            <w:r/>
-            <w:r>
-              <w:rPr>
-                <w:b/>
-                <w:color w:val="1F2328"/>
-                <w:sz w:val="20"/>
-              </w:rPr>
-              <w:t>HCS 8.5.1</w:t>
-            </w:r>
-          </w:p>
-        </w:tc>
-        <w:tc>
-          <w:tcPr>
-            <w:tcW w:type="dxa" w:w="3213"/>
-            <w:shd w:fill="F6F8FA" w:val="clear"/>
-          </w:tcPr>
-          <w:p>
-            <w:r/>
-            <w:r>
-              <w:rPr>
-                <w:color w:val="1F2328"/>
-                <w:sz w:val="20"/>
-              </w:rPr>
-              <w:t>Standard Scenario</w:t>
-            </w:r>
-          </w:p>
-        </w:tc>
-        <w:tc>
-          <w:tcPr>
-            <w:tcW w:type="dxa" w:w="3213"/>
-            <w:shd w:fill="F6F8FA" w:val="clear"/>
-          </w:tcPr>
-          <w:p>
-            <w:r/>
-            <w:r>
-              <w:rPr>
-                <w:color w:val="1F2328"/>
-                <w:sz w:val="20"/>
-              </w:rPr>
-              <w:t>Yes</w:t>
-            </w:r>
-          </w:p>
-        </w:tc>
-      </w:tr>
-      <w:tr>
-        <w:tc>
-          <w:tcPr>
-            <w:tcW w:type="dxa" w:w="3213"/>
-            <w:shd w:fill="FFFFFF" w:val="clear"/>
-          </w:tcPr>
-          <w:p>
-            <w:r/>
-            <w:r>
-              <w:rPr>
-                <w:b/>
-                <w:color w:val="1F2328"/>
-                <w:sz w:val="20"/>
-              </w:rPr>
-              <w:t>HCS 8.5.0</w:t>
-            </w:r>
-          </w:p>
-        </w:tc>
-        <w:tc>
-          <w:tcPr>
-            <w:tcW w:type="dxa" w:w="3213"/>
-            <w:shd w:fill="FFFFFF" w:val="clear"/>
-          </w:tcPr>
-          <w:p>
-            <w:r/>
-            <w:r>
-              <w:rPr>
-                <w:color w:val="1F2328"/>
-                <w:sz w:val="20"/>
-              </w:rPr>
-              <w:t>Standard Scenario</w:t>
-            </w:r>
-          </w:p>
-        </w:tc>
-        <w:tc>
-          <w:tcPr>
-            <w:tcW w:type="dxa" w:w="3213"/>
-            <w:shd w:fill="FFFFFF" w:val="clear"/>
-          </w:tcPr>
-          <w:p>
-            <w:r/>
-            <w:r>
-              <w:rPr>
-                <w:color w:val="1F2328"/>
-                <w:sz w:val="20"/>
-              </w:rPr>
-              <w:t>No</w:t>
-            </w:r>
-          </w:p>
-        </w:tc>
-      </w:tr>
-      <w:tr>
-        <w:tc>
-          <w:tcPr>
-            <w:tcW w:type="dxa" w:w="3213"/>
-            <w:shd w:fill="F6F8FA" w:val="clear"/>
-          </w:tcPr>
-          <w:p>
-            <w:r/>
-            <w:r>
-              <w:rPr>
-                <w:b/>
-                <w:color w:val="1F2328"/>
-                <w:sz w:val="20"/>
-              </w:rPr>
-              <w:t>HCS 8.6.0</w:t>
-            </w:r>
-          </w:p>
-        </w:tc>
-        <w:tc>
-          <w:tcPr>
-            <w:tcW w:type="dxa" w:w="3213"/>
-            <w:shd w:fill="F6F8FA" w:val="clear"/>
-          </w:tcPr>
-          <w:p>
-            <w:r/>
-            <w:r>
-              <w:rPr>
-                <w:color w:val="1F2328"/>
-                <w:sz w:val="20"/>
-              </w:rPr>
-              <w:t>Standard Scenario</w:t>
-            </w:r>
-          </w:p>
-        </w:tc>
-        <w:tc>
-          <w:tcPr>
-            <w:tcW w:type="dxa" w:w="3213"/>
-            <w:shd w:fill="F6F8FA" w:val="clear"/>
-          </w:tcPr>
-          <w:p>
-            <w:r/>
-            <w:r>
-              <w:rPr>
-                <w:color w:val="1F2328"/>
-                <w:sz w:val="20"/>
-              </w:rPr>
-              <w:t>Fixed</w:t>
-            </w:r>
-          </w:p>
-        </w:tc>
-      </w:tr>
-    </w:tbl>
-    <w:p>
-      <w:pPr>
-        <w:pStyle w:val="Heading1"/>
-      </w:pPr>
-      <w:r>
-        <w:rPr>
-          <w:color w:val="C7000B"/>
-        </w:rPr>
-        <w:t>Workaround</w:t>
-      </w:r>
-    </w:p>
-    <w:p>
-      <w:pPr/>
-      <w:r>
-        <w:t>Grant ECS FullAccess permission to the user group associated with the affected user. This restores the enterprise project list on the ECS creation page.</w:t>
-      </w:r>
-    </w:p>
-    <w:tbl>
-      <w:tblPr>
-        <w:tblW w:type="auto" w:w="0"/>
-        <w:tblLook w:firstColumn="1" w:firstRow="1" w:lastColumn="0" w:lastRow="0" w:noHBand="0" w:noVBand="1" w:val="04A0"/>
-        <w:tblBorders>
-          <w:top w:val="none" w:sz="0" w:space="0" w:color="auto"/>
-          <w:left w:val="none" w:sz="0" w:space="0" w:color="auto"/>
-          <w:bottom w:val="none" w:sz="0" w:space="0" w:color="auto"/>
-          <w:right w:val="none" w:sz="0" w:space="0" w:color="auto"/>
-          <w:insideH w:val="none" w:sz="0" w:space="0" w:color="auto"/>
-          <w:insideV w:val="none" w:sz="0" w:space="0" w:color="auto"/>
-        </w:tblBorders>
-      </w:tblPr>
-      <w:tblGrid>
-        <w:gridCol w:w="9639"/>
-      </w:tblGrid>
-      <w:tr>
-        <w:tc>
-          <w:tcPr>
-            <w:tcW w:type="dxa" w:w="9639"/>
-            <w:shd w:fill="FFF8E1" w:val="clear"/>
-            <w:tcBorders>
-              <w:top w:val="single" w:sz="2" w:space="0" w:color="FFF8E1"/>
-              <w:left w:val="single" w:sz="24" w:space="0" w:color="FFC107"/>
-              <w:bottom w:val="single" w:sz="2" w:space="0" w:color="FFF8E1"/>
-              <w:right w:val="single" w:sz="2" w:space="0" w:color="FFF8E1"/>
-            </w:tcBorders>
-            <w:tcMar>
-              <w:top w:w="60" w:type="dxa"/>
-              <w:left w:w="120" w:type="dxa"/>
-              <w:bottom w:w="60" w:type="dxa"/>
-              <w:right w:w="120" w:type="dxa"/>
-            </w:tcMar>
-          </w:tcPr>
-          <w:p>
-            <w:r/>
-            <w:r>
-              <w:rPr>
-                <w:b/>
-                <w:color w:val="F57C00"/>
-                <w:sz w:val="20"/>
-              </w:rPr>
-              <w:t xml:space="preserve">Important: </w:t>
-            </w:r>
-            <w:r>
-              <w:rPr>
-                <w:color w:val="F57C00"/>
-                <w:sz w:val="20"/>
-              </w:rPr>
-              <w:t>Applying this workaround modifies user group permissions. Review the impact before proceeding.</w:t>
-            </w:r>
-          </w:p>
-        </w:tc>
-      </w:tr>
-    </w:tbl>
-    <w:tbl>
-      <w:tblPr>
-        <w:tblW w:type="auto" w:w="0"/>
-        <w:tblLook w:firstColumn="1" w:firstRow="1" w:lastColumn="0" w:lastRow="0" w:noHBand="0" w:noVBand="1" w:val="04A0"/>
-        <w:tblBorders>
-          <w:top w:val="none" w:sz="0" w:space="0" w:color="auto"/>
-          <w:left w:val="none" w:sz="0" w:space="0" w:color="auto"/>
-          <w:bottom w:val="none" w:sz="0" w:space="0" w:color="auto"/>
-          <w:right w:val="none" w:sz="0" w:space="0" w:color="auto"/>
-          <w:insideH w:val="none" w:sz="0" w:space="0" w:color="auto"/>
-          <w:insideV w:val="none" w:sz="0" w:space="0" w:color="auto"/>
-        </w:tblBorders>
-      </w:tblPr>
-      <w:tblGrid>
-        <w:gridCol w:w="9639"/>
-      </w:tblGrid>
-      <w:tr>
-        <w:tc>
-          <w:tcPr>
-            <w:tcW w:type="dxa" w:w="9639"/>
-            <w:shd w:fill="E8F5E9" w:val="clear"/>
-            <w:tcBorders>
-              <w:top w:val="single" w:sz="2" w:space="0" w:color="E8F5E9"/>
-              <w:left w:val="single" w:sz="24" w:space="0" w:color="28A745"/>
-              <w:bottom w:val="single" w:sz="2" w:space="0" w:color="E8F5E9"/>
-              <w:right w:val="single" w:sz="2" w:space="0" w:color="E8F5E9"/>
-            </w:tcBorders>
-            <w:tcMar>
-              <w:top w:w="60" w:type="dxa"/>
-              <w:left w:w="120" w:type="dxa"/>
-              <w:bottom w:w="60" w:type="dxa"/>
-              <w:right w:w="120" w:type="dxa"/>
-            </w:tcMar>
-          </w:tcPr>
-          <w:p>
-            <w:r/>
-            <w:r>
-              <w:rPr>
-                <w:b/>
-                <w:color w:val="2E7D32"/>
-                <w:sz w:val="20"/>
-              </w:rPr>
-              <w:t xml:space="preserve">Tip: </w:t>
-            </w:r>
-            <w:r>
-              <w:rPr>
-                <w:color w:val="2E7D32"/>
-                <w:sz w:val="20"/>
-              </w:rPr>
-              <w:t>Back up the current permission configuration before making any changes. This allows a quick rollback if needed.</w:t>
-            </w:r>
-          </w:p>
-        </w:tc>
-      </w:tr>
-    </w:tbl>
     <w:sectPr>
       <w:headerReference w:type="even" r:id="rId46"/>
       <w:headerReference w:type="default" r:id="rId47"/>

</xml_diff>